<commit_message>
Add bilingual Arabic/English UI with RTL for landing page and dashboard
</commit_message>
<xml_diff>
--- a/Documents/wuduh-brd-v2.docx
+++ b/Documents/wuduh-brd-v2.docx
@@ -465,7 +465,7 @@
                 <w:sz w:val="20"/>
                 <w:szCs w:val="20"/>
               </w:rPr>
-              <w:t xml:space="preserve">Card journey engine — 52 cards, complete/skip mechanics, auto-save on every action</w:t>
+              <w:t xml:space="preserve">Card journey engine — 58 cards, complete/skip mechanics, auto-save on every action</w:t>
             </w:r>
           </w:p>
         </w:tc>
@@ -1418,7 +1418,7 @@
           <w:sz w:val="22"/>
           <w:szCs w:val="22"/>
         </w:rPr>
-        <w:t xml:space="preserve">Financial projections engine and charts → next phase</w:t>
+        <w:t xml:space="preserve">Financial projections engine and charts → ✅ delivered during the MVP build (ahead of plan): live SVG chart in the study UI and an auto-inserted projections page in the PDF export — break-even, month-12 MRR, gross margin, runway. CAC/LTV still to come.</w:t>
       </w:r>
     </w:p>
     <w:p>
@@ -1957,7 +1957,7 @@
           <w:sz w:val="22"/>
           <w:szCs w:val="22"/>
         </w:rPr>
-        <w:t xml:space="preserve">src/proxy.ts — Next.js 16 proxy file (pass-through; auth enforced per-page via getUser())</w:t>
+        <w:t xml:space="preserve">Auth enforced per-route — requireVerifiedUser() in server components and getVerifiedUser() in API routes (both call Better Auth getSession and require a verified email). No middleware/proxy file; src/proxy.ts was removed.</w:t>
       </w:r>
     </w:p>
     <w:p>
@@ -2415,7 +2415,7 @@
           <w:sz w:val="22"/>
           <w:szCs w:val="22"/>
         </w:rPr>
-        <w:t xml:space="preserve">All tables and triggers are live in the self-hosted PostgreSQL 17 database (wuduh) on Coolify, created by supabase/migrations/003_self_hosted_schema.sql. All column names use camelCase to match Better Auth conventions. Four Better Auth tables (users, sessions, accounts, verifications) sit alongside the four Wuduh tables below.</w:t>
+        <w:t xml:space="preserve">All tables and triggers are live in the self-hosted PostgreSQL 17 database (wuduh) on Coolify, created by db/migrations/003_self_hosted_schema.sql. All column names use camelCase to match Better Auth conventions. Four Better Auth tables (users, sessions, accounts, verifications) sit alongside the four Wuduh tables below.</w:t>
       </w:r>
     </w:p>
     <w:p>
@@ -4500,53 +4500,53 @@
           <w:sz w:val="22"/>
           <w:szCs w:val="22"/>
         </w:rPr>
-        <w:t>src/proxy.ts — Next.js 16 proxy file (required by framework); auth guard handled per-page via getUser() in Node.js runtime; edge-level JWT guard planned as a later hardening step</w:t>
-      </w:r>
-    </w:p>
-    <w:p>
-      <w:pPr>
-        <w:pStyle w:val="ListParagraph"/>
-        <w:numPr>
-          <w:ilvl w:val="0"/>
-          <w:numId w:val="2"/>
-        </w:numPr>
-        <w:spacing w:after="40" w:before="40"/>
-      </w:pPr>
-      <w:r>
-        <w:rPr>
-          <w:rFonts w:ascii="Arial" w:cs="Arial" w:eastAsia="Arial" w:hAnsi="Arial"/>
-          <w:b w:val="false"/>
-          <w:bCs w:val="false"/>
-          <w:i w:val="false"/>
-          <w:iCs w:val="false"/>
-          <w:color w:val="2D3748"/>
-          <w:sz w:val="22"/>
-          <w:szCs w:val="22"/>
-        </w:rPr>
-        <w:t xml:space="preserve">supabase/migrations/003_self_hosted_schema.sql — full DB schema, indexes, triggers (the only migration that applies to the current stack)</w:t>
-      </w:r>
-    </w:p>
-    <w:p>
-      <w:pPr>
-        <w:pStyle w:val="ListParagraph"/>
-        <w:numPr>
-          <w:ilvl w:val="0"/>
-          <w:numId w:val="2"/>
-        </w:numPr>
-        <w:spacing w:after="40" w:before="40"/>
-      </w:pPr>
-      <w:r>
-        <w:rPr>
-          <w:rFonts w:ascii="Arial" w:cs="Arial" w:eastAsia="Arial" w:hAnsi="Arial"/>
-          <w:b w:val="false"/>
-          <w:bCs w:val="false"/>
-          <w:i w:val="false"/>
-          <w:iCs w:val="false"/>
-          <w:color w:val="2D3748"/>
-          <w:sz w:val="22"/>
-          <w:szCs w:val="22"/>
-        </w:rPr>
-        <w:t xml:space="preserve">wuduh-cards.json — 52 cards, bilingual, all prompts/hints/examples/table configs</w:t>
+        <w:t xml:space="preserve">Auth guarding — per-route via requireVerifiedUser() (pages) and getVerifiedUser() (API routes) in the Node.js runtime. src/proxy.ts was removed (no middleware file today); an edge-level JWT guard is planned as a later hardening step.</w:t>
+      </w:r>
+    </w:p>
+    <w:p>
+      <w:pPr>
+        <w:pStyle w:val="ListParagraph"/>
+        <w:numPr>
+          <w:ilvl w:val="0"/>
+          <w:numId w:val="2"/>
+        </w:numPr>
+        <w:spacing w:after="40" w:before="40"/>
+      </w:pPr>
+      <w:r>
+        <w:rPr>
+          <w:rFonts w:ascii="Arial" w:cs="Arial" w:eastAsia="Arial" w:hAnsi="Arial"/>
+          <w:b w:val="false"/>
+          <w:bCs w:val="false"/>
+          <w:i w:val="false"/>
+          <w:iCs w:val="false"/>
+          <w:color w:val="2D3748"/>
+          <w:sz w:val="22"/>
+          <w:szCs w:val="22"/>
+        </w:rPr>
+        <w:t xml:space="preserve">db/migrations/003_self_hosted_schema.sql — full DB schema, indexes, triggers (the only migration that applies to the current stack)</w:t>
+      </w:r>
+    </w:p>
+    <w:p>
+      <w:pPr>
+        <w:pStyle w:val="ListParagraph"/>
+        <w:numPr>
+          <w:ilvl w:val="0"/>
+          <w:numId w:val="2"/>
+        </w:numPr>
+        <w:spacing w:after="40" w:before="40"/>
+      </w:pPr>
+      <w:r>
+        <w:rPr>
+          <w:rFonts w:ascii="Arial" w:cs="Arial" w:eastAsia="Arial" w:hAnsi="Arial"/>
+          <w:b w:val="false"/>
+          <w:bCs w:val="false"/>
+          <w:i w:val="false"/>
+          <w:iCs w:val="false"/>
+          <w:color w:val="2D3748"/>
+          <w:sz w:val="22"/>
+          <w:szCs w:val="22"/>
+        </w:rPr>
+        <w:t xml:space="preserve">wuduh-cards.json — 58 cards, bilingual, all prompts/hints/examples/table configs</w:t>
       </w:r>
     </w:p>
     <w:p>

</xml_diff>